<commit_message>
The handout lists stop sitting in ten points of air
Every list item inherited Normal's w:after="200" — 10pt under each
bullet, so enumerated and bulleted lists read as loose paragraphs
rather than lists. OP5 already set its list items to zero explicitly;
the other four did not.

Eighteen list items across OP1-OP4 now carry w:after="0", matching
OP5. Body paragraphs are untouched.

Co-Authored-By: Claude Opus 5 (1M context) <noreply@anthropic.com>
</commit_message>
<xml_diff>
--- a/week-02-writing-place/OP2 Writing Place.docx
+++ b/week-02-writing-place/OP2 Writing Place.docx
@@ -112,6 +112,7 @@
           <w:ilvl w:val="0"/>
           <w:numId w:val="1001"/>
         </w:numPr>
+        <w:spacing w:before="0" w:after="0"/>
         <w:ind w:left="720" w:hanging="360"/>
       </w:pPr>
       <w:r>
@@ -147,6 +148,7 @@
           <w:ilvl w:val="0"/>
           <w:numId w:val="1001"/>
         </w:numPr>
+        <w:spacing w:before="0" w:after="0"/>
         <w:ind w:left="720" w:hanging="360"/>
       </w:pPr>
       <w:r>
@@ -182,6 +184,7 @@
           <w:ilvl w:val="0"/>
           <w:numId w:val="1001"/>
         </w:numPr>
+        <w:spacing w:before="0" w:after="0"/>
         <w:ind w:left="720" w:hanging="360"/>
       </w:pPr>
       <w:r>
@@ -249,6 +252,7 @@
           <w:ilvl w:val="0"/>
           <w:numId w:val="1002"/>
         </w:numPr>
+        <w:spacing w:before="0" w:after="0"/>
         <w:ind w:left="720" w:hanging="360"/>
       </w:pPr>
       <w:r>
@@ -266,6 +270,7 @@
           <w:ilvl w:val="0"/>
           <w:numId w:val="1002"/>
         </w:numPr>
+        <w:spacing w:before="0" w:after="0"/>
         <w:ind w:left="720" w:hanging="360"/>
       </w:pPr>
       <w:r>

</xml_diff>